<commit_message>
docs(investigacion): agregar Tema 2 - acceso a datos desde aplicaciones web
</commit_message>
<xml_diff>
--- a/Informe_Investigacion_Unidad_III.docx
+++ b/Informe_Investigacion_Unidad_III.docx
@@ -238,7 +238,7 @@
           </mc:Choice>
           <mc:Fallback>
             <w:pict>
-              <v:group w14:anchorId="1B16F01F" id="Group 17289" o:spid="_x0000_s1026" style="position:absolute;margin-left:0;margin-top:73.25pt;width:453.5pt;height:0;z-index:251658240;mso-position-horizontal:left;mso-position-horizontal-relative:margin" coordorigin="-45262,381" coordsize="57599,0" o:gfxdata="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">
+              <v:group w14:anchorId="4C453FFA" id="Group 17289" o:spid="_x0000_s1026" style="position:absolute;margin-left:0;margin-top:73.25pt;width:453.5pt;height:0;z-index:251658240;mso-position-horizontal:left;mso-position-horizontal-relative:margin" coordorigin="-45262,381" coordsize="57599,0" o:gfxdata="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">
                 <v:shape id="Shape 14" o:spid="_x0000_s1027" style="position:absolute;left:-45262;top:381;width:57599;height:0;visibility:visible;mso-wrap-style:square;v-text-anchor:top" coordsize="5759996,0" o:gfxdata="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" path="m,l5759996,e" filled="f" strokeweight=".17569mm">
                   <v:stroke miterlimit="83231f" joinstyle="miter"/>
                   <v:path arrowok="t" textboxrect="0,0,5759996,0"/>
@@ -509,21 +509,31 @@
         <w:spacing w:after="108" w:line="259" w:lineRule="auto"/>
         <w:ind w:left="-15" w:right="0" w:firstLine="0"/>
         <w:jc w:val="left"/>
-      </w:pPr>
-      <w:r>
-        <w:rPr>
+        <w:rPr>
+          <w:b/>
+          <w:bCs/>
+        </w:rPr>
+      </w:pPr>
+      <w:r>
+        <w:rPr>
+          <w:b/>
+          <w:bCs/>
           <w:sz w:val="24"/>
         </w:rPr>
         <w:t>2.1</w:t>
       </w:r>
       <w:r>
         <w:rPr>
+          <w:b/>
+          <w:bCs/>
           <w:sz w:val="24"/>
         </w:rPr>
         <w:t xml:space="preserve"> </w:t>
       </w:r>
       <w:r>
         <w:rPr>
+          <w:b/>
+          <w:bCs/>
           <w:sz w:val="24"/>
         </w:rPr>
         <w:t xml:space="preserve">El objeto </w:t>
@@ -531,6 +541,8 @@
       <w:proofErr w:type="spellStart"/>
       <w:r>
         <w:rPr>
+          <w:b/>
+          <w:bCs/>
           <w:sz w:val="24"/>
         </w:rPr>
         <w:t>Request</w:t>
@@ -701,21 +713,31 @@
         <w:spacing w:after="136" w:line="259" w:lineRule="auto"/>
         <w:ind w:left="-15" w:right="0" w:firstLine="0"/>
         <w:jc w:val="left"/>
-      </w:pPr>
-      <w:r>
-        <w:rPr>
+        <w:rPr>
+          <w:b/>
+          <w:bCs/>
+        </w:rPr>
+      </w:pPr>
+      <w:r>
+        <w:rPr>
+          <w:b/>
+          <w:bCs/>
           <w:sz w:val="24"/>
         </w:rPr>
         <w:t>2.2</w:t>
       </w:r>
       <w:r>
         <w:rPr>
+          <w:b/>
+          <w:bCs/>
           <w:sz w:val="24"/>
         </w:rPr>
         <w:t xml:space="preserve"> </w:t>
       </w:r>
       <w:r>
         <w:rPr>
+          <w:b/>
+          <w:bCs/>
           <w:sz w:val="24"/>
         </w:rPr>
         <w:t>El objeto Response</w:t>
@@ -832,9 +854,15 @@
         <w:spacing w:after="108" w:line="259" w:lineRule="auto"/>
         <w:ind w:left="-15" w:right="0" w:firstLine="0"/>
         <w:jc w:val="left"/>
-      </w:pPr>
-      <w:r>
-        <w:rPr>
+        <w:rPr>
+          <w:b/>
+          <w:bCs/>
+        </w:rPr>
+      </w:pPr>
+      <w:r>
+        <w:rPr>
+          <w:b/>
+          <w:bCs/>
           <w:sz w:val="24"/>
         </w:rPr>
         <w:lastRenderedPageBreak/>
@@ -842,12 +870,16 @@
       </w:r>
       <w:r>
         <w:rPr>
+          <w:b/>
+          <w:bCs/>
           <w:sz w:val="24"/>
         </w:rPr>
         <w:t xml:space="preserve"> </w:t>
       </w:r>
       <w:r>
         <w:rPr>
+          <w:b/>
+          <w:bCs/>
           <w:sz w:val="24"/>
         </w:rPr>
         <w:t>El objeto Session</w:t>
@@ -1044,21 +1076,31 @@
         <w:spacing w:after="108" w:line="259" w:lineRule="auto"/>
         <w:ind w:left="-15" w:right="0" w:firstLine="0"/>
         <w:jc w:val="left"/>
-      </w:pPr>
-      <w:r>
-        <w:rPr>
+        <w:rPr>
+          <w:b/>
+          <w:bCs/>
+        </w:rPr>
+      </w:pPr>
+      <w:r>
+        <w:rPr>
+          <w:b/>
+          <w:bCs/>
           <w:sz w:val="24"/>
         </w:rPr>
         <w:t>2.4</w:t>
       </w:r>
       <w:r>
         <w:rPr>
+          <w:b/>
+          <w:bCs/>
           <w:sz w:val="24"/>
         </w:rPr>
         <w:t xml:space="preserve"> </w:t>
       </w:r>
       <w:r>
         <w:rPr>
+          <w:b/>
+          <w:bCs/>
           <w:sz w:val="24"/>
         </w:rPr>
         <w:t xml:space="preserve">Los objetos </w:t>
@@ -1066,6 +1108,8 @@
       <w:proofErr w:type="spellStart"/>
       <w:r>
         <w:rPr>
+          <w:b/>
+          <w:bCs/>
           <w:sz w:val="24"/>
         </w:rPr>
         <w:t>Application</w:t>
@@ -1073,6 +1117,8 @@
       <w:proofErr w:type="spellEnd"/>
       <w:r>
         <w:rPr>
+          <w:b/>
+          <w:bCs/>
           <w:sz w:val="24"/>
         </w:rPr>
         <w:t xml:space="preserve"> y Page</w:t>
@@ -1249,13 +1295,619 @@
         </w:rPr>
       </w:pPr>
     </w:p>
+    <w:p>
+      <w:pPr>
+        <w:pStyle w:val="Ttulo1"/>
+      </w:pPr>
+      <w:r>
+        <w:lastRenderedPageBreak/>
+        <w:t>Tema 2: Acceso a Datos desde Aplicaciones Web</w:t>
+      </w:r>
+    </w:p>
+    <w:p>
+      <w:pPr>
+        <w:spacing w:after="109" w:line="259" w:lineRule="auto"/>
+        <w:ind w:left="435" w:right="0" w:firstLine="0"/>
+        <w:jc w:val="left"/>
+      </w:pPr>
+      <w:r>
+        <w:t>Casi ninguna aplicación web tiene sentido sin una base de datos detrás: el backend necesita guardar, consultar y modificar información de forma persistente, mucho después de que la petición HTTP que la originó ya terminó. Pero el lenguaje de programación del backend y el motor de base de datos son dos mundos distintos, que hablan protocolos distintos, y conectarlos de forma segura y eficiente requiere tecnologías específicas. Este tema revisa esas tecnologías, desde el acceso más directo con SQL hasta las capas de abstracción que evitan escribirlo a mano.</w:t>
+      </w:r>
+    </w:p>
+    <w:p>
+      <w:pPr>
+        <w:spacing w:after="109" w:line="259" w:lineRule="auto"/>
+        <w:ind w:left="435" w:right="0" w:firstLine="0"/>
+        <w:jc w:val="left"/>
+        <w:rPr>
+          <w:color w:val="2E8C57"/>
+          <w:sz w:val="29"/>
+        </w:rPr>
+      </w:pPr>
+    </w:p>
+    <w:p>
+      <w:pPr>
+        <w:spacing w:after="109" w:line="259" w:lineRule="auto"/>
+        <w:ind w:left="435" w:right="0" w:firstLine="0"/>
+        <w:jc w:val="left"/>
+        <w:rPr>
+          <w:b/>
+          <w:bCs/>
+          <w:sz w:val="24"/>
+        </w:rPr>
+      </w:pPr>
+      <w:r>
+        <w:rPr>
+          <w:b/>
+          <w:bCs/>
+          <w:sz w:val="24"/>
+        </w:rPr>
+        <w:t>3.1</w:t>
+      </w:r>
+      <w:r>
+        <w:rPr>
+          <w:b/>
+          <w:bCs/>
+          <w:sz w:val="24"/>
+        </w:rPr>
+        <w:t xml:space="preserve"> Tecnologías de acceso a datos en aplicaciones web</w:t>
+      </w:r>
+    </w:p>
+    <w:p>
+      <w:pPr>
+        <w:spacing w:after="109" w:line="259" w:lineRule="auto"/>
+        <w:ind w:left="435" w:right="0" w:firstLine="0"/>
+        <w:rPr>
+          <w:sz w:val="24"/>
+        </w:rPr>
+      </w:pPr>
+      <w:r>
+        <w:rPr>
+          <w:sz w:val="24"/>
+        </w:rPr>
+        <w:t xml:space="preserve">Cada plataforma de programación del lado del servidor ofrece su propia forma estándar de conectarse a una base de datos relacional. En Java, esa forma es JDBC (Java </w:t>
+      </w:r>
+      <w:proofErr w:type="spellStart"/>
+      <w:r>
+        <w:rPr>
+          <w:sz w:val="24"/>
+        </w:rPr>
+        <w:t>Database</w:t>
+      </w:r>
+      <w:proofErr w:type="spellEnd"/>
+      <w:r>
+        <w:rPr>
+          <w:sz w:val="24"/>
+        </w:rPr>
+        <w:t xml:space="preserve"> </w:t>
+      </w:r>
+      <w:proofErr w:type="spellStart"/>
+      <w:r>
+        <w:rPr>
+          <w:sz w:val="24"/>
+        </w:rPr>
+        <w:t>Connectivity</w:t>
+      </w:r>
+      <w:proofErr w:type="spellEnd"/>
+      <w:r>
+        <w:rPr>
+          <w:sz w:val="24"/>
+        </w:rPr>
+        <w:t xml:space="preserve">), una API que permite que el código Java se conecte a prácticamente cualquier motor de base de datos a través de un driver específico para ese motor, ejecute sentencias SQL, y reciba los resultados como objetos que el propio programa puede recorrer, como un </w:t>
+      </w:r>
+      <w:proofErr w:type="spellStart"/>
+      <w:r>
+        <w:rPr>
+          <w:sz w:val="24"/>
+        </w:rPr>
+        <w:t>ResultSet</w:t>
+      </w:r>
+      <w:proofErr w:type="spellEnd"/>
+      <w:r>
+        <w:rPr>
+          <w:sz w:val="24"/>
+        </w:rPr>
+        <w:t xml:space="preserve"> </w:t>
+      </w:r>
+      <w:sdt>
+        <w:sdtPr>
+          <w:rPr>
+            <w:sz w:val="24"/>
+          </w:rPr>
+          <w:tag w:val="MENDELEY_CITATION_v3_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"/>
+          <w:id w:val="-2061541765"/>
+          <w:placeholder>
+            <w:docPart w:val="DefaultPlaceholder_-1854013440"/>
+          </w:placeholder>
+        </w:sdtPr>
+        <w:sdtContent>
+          <w:r>
+            <w:rPr>
+              <w:sz w:val="24"/>
+            </w:rPr>
+            <w:t>[4]</w:t>
+          </w:r>
+        </w:sdtContent>
+      </w:sdt>
+      <w:r>
+        <w:rPr>
+          <w:sz w:val="24"/>
+        </w:rPr>
+        <w:t xml:space="preserve">. Lo importante de JDBC es que el código de la aplicación no necesita saber los detalles internos de comunicación con la base de datos: solo necesita el driver correcto y una cadena de conexión, y toda la complejidad de hablar el protocolo nativo del motor queda oculta detrás de esa API común. En PHP existe un equivalente llamado PDO (PHP Data </w:t>
+      </w:r>
+      <w:proofErr w:type="spellStart"/>
+      <w:r>
+        <w:rPr>
+          <w:sz w:val="24"/>
+        </w:rPr>
+        <w:t>Objects</w:t>
+      </w:r>
+      <w:proofErr w:type="spellEnd"/>
+      <w:r>
+        <w:rPr>
+          <w:sz w:val="24"/>
+        </w:rPr>
+        <w:t xml:space="preserve">), una extensión que ofrece una interfaz consistente para trabajar con distintos motores de base de datos —MySQL, PostgreSQL, SQLite, entre otros— usando prácticamente el mismo código, de modo que cambiar de motor de base de datos implica modificar poco más que la cadena de conexión </w:t>
+      </w:r>
+      <w:sdt>
+        <w:sdtPr>
+          <w:rPr>
+            <w:sz w:val="24"/>
+          </w:rPr>
+          <w:tag w:val="MENDELEY_CITATION_v3_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"/>
+          <w:id w:val="-813404276"/>
+          <w:placeholder>
+            <w:docPart w:val="DefaultPlaceholder_-1854013440"/>
+          </w:placeholder>
+        </w:sdtPr>
+        <w:sdtContent>
+          <w:r>
+            <w:rPr>
+              <w:sz w:val="24"/>
+            </w:rPr>
+            <w:t>[5]</w:t>
+          </w:r>
+        </w:sdtContent>
+      </w:sdt>
+      <w:r>
+        <w:rPr>
+          <w:sz w:val="24"/>
+        </w:rPr>
+        <w:t>. En ambos casos, la idea de fondo es la misma: aislar al desarrollador de los detalles particulares del motor de base de datos que se esté usando en ese momento.</w:t>
+      </w:r>
+    </w:p>
+    <w:p>
+      <w:pPr>
+        <w:spacing w:after="109" w:line="259" w:lineRule="auto"/>
+        <w:ind w:left="435" w:right="0" w:firstLine="0"/>
+        <w:jc w:val="left"/>
+        <w:rPr>
+          <w:b/>
+          <w:bCs/>
+          <w:sz w:val="24"/>
+        </w:rPr>
+      </w:pPr>
+      <w:r>
+        <w:rPr>
+          <w:b/>
+          <w:bCs/>
+          <w:sz w:val="24"/>
+        </w:rPr>
+        <w:t>3.</w:t>
+      </w:r>
+      <w:r>
+        <w:rPr>
+          <w:b/>
+          <w:bCs/>
+          <w:sz w:val="24"/>
+        </w:rPr>
+        <w:t>2</w:t>
+      </w:r>
+      <w:r>
+        <w:rPr>
+          <w:b/>
+          <w:bCs/>
+          <w:sz w:val="24"/>
+        </w:rPr>
+        <w:t xml:space="preserve"> Consultas SQL desde aplicaciones web</w:t>
+      </w:r>
+    </w:p>
+    <w:p>
+      <w:pPr>
+        <w:spacing w:after="109" w:line="259" w:lineRule="auto"/>
+        <w:ind w:left="435" w:right="0" w:firstLine="0"/>
+        <w:rPr>
+          <w:sz w:val="24"/>
+        </w:rPr>
+      </w:pPr>
+      <w:r>
+        <w:rPr>
+          <w:sz w:val="24"/>
+        </w:rPr>
+        <w:t xml:space="preserve">Enviar una consulta SQL desde una aplicación web no es tan simple como pegar el texto del SQL directamente, sobre todo cuando esa consulta depende de datos que ingresó el usuario, como un nombre de búsqueda o un identificador. Construir la consulta concatenando ese dato directamente dentro del texto SQL abre la puerta a la inyección SQL, uno de los riesgos de seguridad más conocidos en aplicaciones web. La forma correcta y estándar de evitarlo es mediante sentencias preparadas: primero se define la estructura de la consulta con espacios reservados para los valores variables, y luego esos valores se envían por separado al motor de base de datos, que nunca los interpreta como parte del código SQL, sino solamente como datos. En JDBC, esto se logra con un objeto </w:t>
+      </w:r>
+      <w:proofErr w:type="spellStart"/>
+      <w:r>
+        <w:rPr>
+          <w:sz w:val="24"/>
+        </w:rPr>
+        <w:t>PreparedStatement</w:t>
+      </w:r>
+      <w:proofErr w:type="spellEnd"/>
+      <w:r>
+        <w:rPr>
+          <w:sz w:val="24"/>
+        </w:rPr>
+        <w:t xml:space="preserve">, creado a partir de </w:t>
+      </w:r>
+      <w:proofErr w:type="spellStart"/>
+      <w:proofErr w:type="gramStart"/>
+      <w:r>
+        <w:rPr>
+          <w:sz w:val="24"/>
+        </w:rPr>
+        <w:t>connection.prepareStatement</w:t>
+      </w:r>
+      <w:proofErr w:type="spellEnd"/>
+      <w:proofErr w:type="gramEnd"/>
+      <w:r>
+        <w:rPr>
+          <w:sz w:val="24"/>
+        </w:rPr>
+        <w:t xml:space="preserve">(), donde los valores se asignan uno por uno con métodos como </w:t>
+      </w:r>
+      <w:proofErr w:type="spellStart"/>
+      <w:proofErr w:type="gramStart"/>
+      <w:r>
+        <w:rPr>
+          <w:sz w:val="24"/>
+        </w:rPr>
+        <w:t>setString</w:t>
+      </w:r>
+      <w:proofErr w:type="spellEnd"/>
+      <w:r>
+        <w:rPr>
+          <w:sz w:val="24"/>
+        </w:rPr>
+        <w:t>(</w:t>
+      </w:r>
+      <w:proofErr w:type="gramEnd"/>
+      <w:r>
+        <w:rPr>
+          <w:sz w:val="24"/>
+        </w:rPr>
+        <w:t xml:space="preserve">) o </w:t>
+      </w:r>
+      <w:proofErr w:type="spellStart"/>
+      <w:proofErr w:type="gramStart"/>
+      <w:r>
+        <w:rPr>
+          <w:sz w:val="24"/>
+        </w:rPr>
+        <w:t>setInt</w:t>
+      </w:r>
+      <w:proofErr w:type="spellEnd"/>
+      <w:r>
+        <w:rPr>
+          <w:sz w:val="24"/>
+        </w:rPr>
+        <w:t>(</w:t>
+      </w:r>
+      <w:proofErr w:type="gramEnd"/>
+      <w:r>
+        <w:rPr>
+          <w:sz w:val="24"/>
+        </w:rPr>
+        <w:t xml:space="preserve">) antes de ejecutar la consulta </w:t>
+      </w:r>
+      <w:sdt>
+        <w:sdtPr>
+          <w:rPr>
+            <w:sz w:val="24"/>
+          </w:rPr>
+          <w:tag w:val="MENDELEY_CITATION_v3_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"/>
+          <w:id w:val="-801765256"/>
+          <w:placeholder>
+            <w:docPart w:val="DefaultPlaceholder_-1854013440"/>
+          </w:placeholder>
+        </w:sdtPr>
+        <w:sdtContent>
+          <w:r>
+            <w:rPr>
+              <w:sz w:val="24"/>
+            </w:rPr>
+            <w:t>[4]</w:t>
+          </w:r>
+        </w:sdtContent>
+      </w:sdt>
+      <w:r>
+        <w:rPr>
+          <w:sz w:val="24"/>
+        </w:rPr>
+        <w:t xml:space="preserve">. En PDO, el mismo patrón se logra con </w:t>
+      </w:r>
+      <w:proofErr w:type="gramStart"/>
+      <w:r>
+        <w:rPr>
+          <w:sz w:val="24"/>
+        </w:rPr>
+        <w:t>prepare(</w:t>
+      </w:r>
+      <w:proofErr w:type="gramEnd"/>
+      <w:r>
+        <w:rPr>
+          <w:sz w:val="24"/>
+        </w:rPr>
+        <w:t xml:space="preserve">), </w:t>
+      </w:r>
+      <w:proofErr w:type="spellStart"/>
+      <w:proofErr w:type="gramStart"/>
+      <w:r>
+        <w:rPr>
+          <w:sz w:val="24"/>
+        </w:rPr>
+        <w:t>bindValue</w:t>
+      </w:r>
+      <w:proofErr w:type="spellEnd"/>
+      <w:r>
+        <w:rPr>
+          <w:sz w:val="24"/>
+        </w:rPr>
+        <w:t>(</w:t>
+      </w:r>
+      <w:proofErr w:type="gramEnd"/>
+      <w:r>
+        <w:rPr>
+          <w:sz w:val="24"/>
+        </w:rPr>
+        <w:t xml:space="preserve">) y </w:t>
+      </w:r>
+      <w:proofErr w:type="spellStart"/>
+      <w:proofErr w:type="gramStart"/>
+      <w:r>
+        <w:rPr>
+          <w:sz w:val="24"/>
+        </w:rPr>
+        <w:t>execute</w:t>
+      </w:r>
+      <w:proofErr w:type="spellEnd"/>
+      <w:r>
+        <w:rPr>
+          <w:sz w:val="24"/>
+        </w:rPr>
+        <w:t>(</w:t>
+      </w:r>
+      <w:proofErr w:type="gramEnd"/>
+      <w:r>
+        <w:rPr>
+          <w:sz w:val="24"/>
+        </w:rPr>
+        <w:t xml:space="preserve">) </w:t>
+      </w:r>
+      <w:sdt>
+        <w:sdtPr>
+          <w:rPr>
+            <w:sz w:val="24"/>
+          </w:rPr>
+          <w:tag w:val="MENDELEY_CITATION_v3_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"/>
+          <w:id w:val="256180983"/>
+          <w:placeholder>
+            <w:docPart w:val="DefaultPlaceholder_-1854013440"/>
+          </w:placeholder>
+        </w:sdtPr>
+        <w:sdtContent>
+          <w:r>
+            <w:rPr>
+              <w:sz w:val="24"/>
+            </w:rPr>
+            <w:t>[5]</w:t>
+          </w:r>
+        </w:sdtContent>
+      </w:sdt>
+      <w:r>
+        <w:rPr>
+          <w:sz w:val="24"/>
+        </w:rPr>
+        <w:t>. Además de la seguridad, las sentencias preparadas también ofrecen una ventaja de rendimiento cuando la misma consulta se ejecuta muchas veces con distintos valores, porque el motor de base de datos puede reutilizar el plan de ejecución ya calculado en lugar de recompilarlo cada vez.</w:t>
+      </w:r>
+    </w:p>
+    <w:p>
+      <w:pPr>
+        <w:spacing w:after="109" w:line="259" w:lineRule="auto"/>
+        <w:ind w:left="435" w:right="0" w:firstLine="0"/>
+        <w:jc w:val="left"/>
+      </w:pPr>
+    </w:p>
+    <w:p>
+      <w:pPr>
+        <w:spacing w:after="109" w:line="259" w:lineRule="auto"/>
+        <w:ind w:left="435" w:right="0" w:firstLine="0"/>
+        <w:jc w:val="left"/>
+      </w:pPr>
+    </w:p>
+    <w:p>
+      <w:pPr>
+        <w:spacing w:after="109" w:line="259" w:lineRule="auto"/>
+        <w:ind w:left="435" w:right="0" w:firstLine="0"/>
+        <w:jc w:val="left"/>
+        <w:rPr>
+          <w:b/>
+          <w:bCs/>
+          <w:sz w:val="24"/>
+        </w:rPr>
+      </w:pPr>
+      <w:r>
+        <w:rPr>
+          <w:b/>
+          <w:bCs/>
+          <w:sz w:val="24"/>
+        </w:rPr>
+        <w:lastRenderedPageBreak/>
+        <w:t>3.</w:t>
+      </w:r>
+      <w:r>
+        <w:rPr>
+          <w:b/>
+          <w:bCs/>
+          <w:sz w:val="24"/>
+        </w:rPr>
+        <w:t>3</w:t>
+      </w:r>
+      <w:r>
+        <w:rPr>
+          <w:b/>
+          <w:bCs/>
+          <w:sz w:val="24"/>
+        </w:rPr>
+        <w:t xml:space="preserve"> Procedimientos almacenados y funciones de BD</w:t>
+      </w:r>
+    </w:p>
+    <w:p>
+      <w:pPr>
+        <w:spacing w:after="109" w:line="259" w:lineRule="auto"/>
+        <w:ind w:left="435" w:right="0" w:firstLine="0"/>
+      </w:pPr>
+      <w:r>
+        <w:t xml:space="preserve">Un procedimiento almacenado o una función de base de datos es un bloque de lógica que se guarda directamente dentro del motor de base de datos, en lugar de vivir en el código de la aplicación, y que se invoca por su nombre en vez de enviar el texto completo de la consulta cada vez. En PostgreSQL, la distinción entre ambos es concreta: una función devuelve un valor y puede usarse dentro de otras expresiones, como en una cláusula SELECT o WHERE, mientras que un procedimiento no devuelve ningún valor y se ejecuta con la instrucción CALL; además, solo los procedimientos pueden controlar transacciones completas dentro de su propio cuerpo, haciendo COMMIT o ROLLBACK, algo que una función no puede hacer </w:t>
+      </w:r>
+      <w:sdt>
+        <w:sdtPr>
+          <w:tag w:val="MENDELEY_CITATION_v3_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"/>
+          <w:id w:val="695356391"/>
+          <w:placeholder>
+            <w:docPart w:val="DefaultPlaceholder_-1854013440"/>
+          </w:placeholder>
+        </w:sdtPr>
+        <w:sdtContent>
+          <w:r>
+            <w:t>[6]</w:t>
+          </w:r>
+        </w:sdtContent>
+      </w:sdt>
+      <w:r>
+        <w:t>. La principal ventaja de mover lógica al motor de base de datos es que esa lógica queda centralizada en un solo lugar: si varias aplicaciones distintas acceden a la misma base de datos, todas comparten exactamente las mismas reglas, sin duplicar validaciones en cada aplicación por separado, y se reduce la cantidad de datos que viajan por la red en cada operación. La desventaja es que esa lógica queda atada a un motor de base de datos específico, es más difícil de probar y versionar con las mismas herramientas que se usan para el resto del código de la aplicación, y dificulta escalar o migrar el backend de forma independiente de la base de datos.</w:t>
+      </w:r>
+    </w:p>
+    <w:p>
+      <w:pPr>
+        <w:spacing w:after="109" w:line="259" w:lineRule="auto"/>
+        <w:ind w:left="435" w:right="0" w:firstLine="0"/>
+        <w:jc w:val="left"/>
+        <w:rPr>
+          <w:b/>
+          <w:bCs/>
+          <w:sz w:val="24"/>
+        </w:rPr>
+      </w:pPr>
+      <w:r>
+        <w:rPr>
+          <w:b/>
+          <w:bCs/>
+          <w:sz w:val="24"/>
+        </w:rPr>
+        <w:t>3.</w:t>
+      </w:r>
+      <w:r>
+        <w:rPr>
+          <w:b/>
+          <w:bCs/>
+          <w:sz w:val="24"/>
+        </w:rPr>
+        <w:t>4</w:t>
+      </w:r>
+      <w:r>
+        <w:rPr>
+          <w:b/>
+          <w:bCs/>
+          <w:sz w:val="24"/>
+        </w:rPr>
+        <w:t xml:space="preserve"> ORM y mapeo objeto-relacional</w:t>
+      </w:r>
+    </w:p>
+    <w:p>
+      <w:pPr>
+        <w:spacing w:after="109" w:line="259" w:lineRule="auto"/>
+        <w:ind w:left="435" w:right="0" w:firstLine="0"/>
+      </w:pPr>
+      <w:r>
+        <w:t xml:space="preserve">El mapeo objeto-relacional (ORM) nace de un problema de fondo conocido como </w:t>
+      </w:r>
+      <w:proofErr w:type="spellStart"/>
+      <w:r>
+        <w:t>impedance</w:t>
+      </w:r>
+      <w:proofErr w:type="spellEnd"/>
+      <w:r>
+        <w:t xml:space="preserve"> </w:t>
+      </w:r>
+      <w:proofErr w:type="spellStart"/>
+      <w:r>
+        <w:t>mismatch</w:t>
+      </w:r>
+      <w:proofErr w:type="spellEnd"/>
+      <w:r>
+        <w:t>: el código orientado a objetos trabaja con clases, herencia y referencias entre objetos, mientras que una base de datos relacional trabaja con tablas, filas y claves foráneas, y estos dos modelos no encajan perfectamente entre sí. Un ORM es la herramienta que traduce automáticamente entre ambos mundos, permitiendo que el desarrollador trabaje con objetos normales de su lenguaje de programación mientras el ORM genera por detrás el SQL necesario para guardar o recuperar esos objetos de la base de datos. En el ecosistema Java, el estándar para esto es JPA (</w:t>
+      </w:r>
+      <w:proofErr w:type="spellStart"/>
+      <w:r>
+        <w:t>Jakarta</w:t>
+      </w:r>
+      <w:proofErr w:type="spellEnd"/>
+      <w:r>
+        <w:t xml:space="preserve"> </w:t>
+      </w:r>
+      <w:proofErr w:type="spellStart"/>
+      <w:r>
+        <w:t>Persistence</w:t>
+      </w:r>
+      <w:proofErr w:type="spellEnd"/>
+      <w:r>
+        <w:t xml:space="preserve"> API): una especificación, no una implementación concreta, que define anotaciones como @Entity para marcar que una clase corresponde a una tabla, y una API llamada </w:t>
+      </w:r>
+      <w:proofErr w:type="spellStart"/>
+      <w:r>
+        <w:t>EntityManager</w:t>
+      </w:r>
+      <w:proofErr w:type="spellEnd"/>
+      <w:r>
+        <w:t xml:space="preserve"> para guardar, consultar, actualizar o eliminar esos objetos sin escribir SQL directamente </w:t>
+      </w:r>
+      <w:sdt>
+        <w:sdtPr>
+          <w:tag w:val="MENDELEY_CITATION_v3_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"/>
+          <w:id w:val="-313103498"/>
+          <w:placeholder>
+            <w:docPart w:val="DefaultPlaceholder_-1854013440"/>
+          </w:placeholder>
+        </w:sdtPr>
+        <w:sdtContent>
+          <w:r>
+            <w:t>[7]</w:t>
+          </w:r>
+        </w:sdtContent>
+      </w:sdt>
+      <w:r>
+        <w:t xml:space="preserve">. Como toda especificación, JPA necesita un proveedor que la implemente realmente; </w:t>
+      </w:r>
+      <w:proofErr w:type="spellStart"/>
+      <w:r>
+        <w:t>Hibernate</w:t>
+      </w:r>
+      <w:proofErr w:type="spellEnd"/>
+      <w:r>
+        <w:t xml:space="preserve"> es, en la práctica, el proveedor más usado del ecosistema Java para cumplir esa especificación. La ventaja de un ORM es velocidad de desarrollo para las operaciones CRUD típicas, ya que evita escribir SQL repetitivo a mano; la desventaja aparece en consultas más complejas o de reportes, donde el SQL generado automáticamente puede ser menos eficiente que uno escrito directamente, una consideración de rendimiento que conecta directamente con los patrones de caché que se revisan en el Tema 4.</w:t>
+      </w:r>
+    </w:p>
+    <w:p>
+      <w:pPr>
+        <w:spacing w:after="109" w:line="259" w:lineRule="auto"/>
+        <w:ind w:left="435" w:right="0" w:firstLine="0"/>
+      </w:pPr>
+    </w:p>
     <w:sdt>
       <w:sdtPr>
-        <w:rPr>
-          <w:lang w:val="en-US"/>
-        </w:rPr>
         <w:tag w:val="MENDELEY_BIBLIOGRAPHY"/>
-        <w:id w:val="-1921556716"/>
+        <w:id w:val="-1374847388"/>
         <w:placeholder>
           <w:docPart w:val="DefaultPlaceholder_-1854013440"/>
         </w:placeholder>
@@ -1266,7 +1918,7 @@
             <w:autoSpaceDE w:val="0"/>
             <w:autoSpaceDN w:val="0"/>
             <w:ind w:hanging="640"/>
-            <w:divId w:val="920598841"/>
+            <w:divId w:val="906110940"/>
             <w:rPr>
               <w:rFonts w:eastAsia="Times New Roman"/>
               <w:kern w:val="0"/>
@@ -1295,7 +1947,7 @@
             <w:autoSpaceDE w:val="0"/>
             <w:autoSpaceDN w:val="0"/>
             <w:ind w:hanging="640"/>
-            <w:divId w:val="1188325137"/>
+            <w:divId w:val="506941999"/>
             <w:rPr>
               <w:rFonts w:eastAsia="Times New Roman"/>
               <w:lang w:val="en-US"/>
@@ -1338,7 +1990,7 @@
             <w:autoSpaceDE w:val="0"/>
             <w:autoSpaceDN w:val="0"/>
             <w:ind w:hanging="640"/>
-            <w:divId w:val="1018584518"/>
+            <w:divId w:val="2081248830"/>
             <w:rPr>
               <w:rFonts w:eastAsia="Times New Roman"/>
               <w:lang w:val="en-US"/>
@@ -1362,12 +2014,117 @@
         </w:p>
         <w:p>
           <w:pPr>
+            <w:autoSpaceDE w:val="0"/>
+            <w:autoSpaceDN w:val="0"/>
+            <w:ind w:hanging="640"/>
+            <w:divId w:val="567150421"/>
+            <w:rPr>
+              <w:rFonts w:eastAsia="Times New Roman"/>
+              <w:lang w:val="en-US"/>
+            </w:rPr>
+          </w:pPr>
+          <w:r>
+            <w:rPr>
+              <w:rFonts w:eastAsia="Times New Roman"/>
+              <w:lang w:val="en-US"/>
+            </w:rPr>
+            <w:t>[4]</w:t>
+          </w:r>
+          <w:r>
+            <w:rPr>
+              <w:rFonts w:eastAsia="Times New Roman"/>
+              <w:lang w:val="en-US"/>
+            </w:rPr>
+            <w:tab/>
+            <w:t>Oracle, “Lesson: JDBC Basics.” Accessed: Jul. 15, 2026. [Online]. Available: https://docs.oracle.com/javase/tutorial/jdbc/basics/index.html</w:t>
+          </w:r>
+        </w:p>
+        <w:p>
+          <w:pPr>
+            <w:autoSpaceDE w:val="0"/>
+            <w:autoSpaceDN w:val="0"/>
+            <w:ind w:hanging="640"/>
+            <w:divId w:val="932980981"/>
+            <w:rPr>
+              <w:rFonts w:eastAsia="Times New Roman"/>
+              <w:lang w:val="en-US"/>
+            </w:rPr>
+          </w:pPr>
+          <w:r>
+            <w:rPr>
+              <w:rFonts w:eastAsia="Times New Roman"/>
+              <w:lang w:val="en-US"/>
+            </w:rPr>
+            <w:t>[5]</w:t>
+          </w:r>
+          <w:r>
+            <w:rPr>
+              <w:rFonts w:eastAsia="Times New Roman"/>
+              <w:lang w:val="en-US"/>
+            </w:rPr>
+            <w:tab/>
+            <w:t>The PHP Group, “PDO.” Accessed: Jul. 15, 2026. [Online]. Available: https://www.php.net/manual/en/book.pdo.php</w:t>
+          </w:r>
+        </w:p>
+        <w:p>
+          <w:pPr>
+            <w:autoSpaceDE w:val="0"/>
+            <w:autoSpaceDN w:val="0"/>
+            <w:ind w:hanging="640"/>
+            <w:divId w:val="1846901686"/>
+            <w:rPr>
+              <w:rFonts w:eastAsia="Times New Roman"/>
+              <w:lang w:val="en-US"/>
+            </w:rPr>
+          </w:pPr>
+          <w:r>
+            <w:rPr>
+              <w:rFonts w:eastAsia="Times New Roman"/>
+              <w:lang w:val="en-US"/>
+            </w:rPr>
+            <w:lastRenderedPageBreak/>
+            <w:t>[6]</w:t>
+          </w:r>
+          <w:r>
+            <w:rPr>
+              <w:rFonts w:eastAsia="Times New Roman"/>
+              <w:lang w:val="en-US"/>
+            </w:rPr>
+            <w:tab/>
+            <w:t>PostgreSQL Global Development Group, “CREATE PROCEDURE.” Accessed: Jul. 15, 2026. [Online]. Available: https://www.postgresql.org/docs/current/sql-createprocedure.html</w:t>
+          </w:r>
+        </w:p>
+        <w:p>
+          <w:pPr>
+            <w:autoSpaceDE w:val="0"/>
+            <w:autoSpaceDN w:val="0"/>
+            <w:ind w:hanging="640"/>
+            <w:divId w:val="484862047"/>
+            <w:rPr>
+              <w:rFonts w:eastAsia="Times New Roman"/>
+              <w:lang w:val="en-US"/>
+            </w:rPr>
+          </w:pPr>
+          <w:r>
+            <w:rPr>
+              <w:rFonts w:eastAsia="Times New Roman"/>
+              <w:lang w:val="en-US"/>
+            </w:rPr>
+            <w:t>[7]</w:t>
+          </w:r>
+          <w:r>
+            <w:rPr>
+              <w:rFonts w:eastAsia="Times New Roman"/>
+              <w:lang w:val="en-US"/>
+            </w:rPr>
+            <w:tab/>
+            <w:t>Eclipse Foundation, “Jakarta Persistence 3.0 Specification.” Accessed: Jul. 15, 2026. [Online]. Available: https://jakarta.ee/specifications/persistence/3.0/jakarta-persistence-spec-3.0.html</w:t>
+          </w:r>
+        </w:p>
+        <w:p>
+          <w:pPr>
             <w:spacing w:after="109" w:line="259" w:lineRule="auto"/>
             <w:ind w:left="435" w:right="0" w:firstLine="0"/>
-            <w:jc w:val="left"/>
-            <w:rPr>
-              <w:lang w:val="en-US"/>
-            </w:rPr>
           </w:pPr>
           <w:r>
             <w:rPr>
@@ -1379,16 +2136,6 @@
         </w:p>
       </w:sdtContent>
     </w:sdt>
-    <w:p>
-      <w:pPr>
-        <w:spacing w:after="109" w:line="259" w:lineRule="auto"/>
-        <w:ind w:left="435" w:right="0" w:firstLine="0"/>
-        <w:jc w:val="left"/>
-        <w:rPr>
-          <w:lang w:val="en-US"/>
-        </w:rPr>
-      </w:pPr>
-    </w:p>
     <w:sectPr>
       <w:headerReference w:type="even" r:id="rId8"/>
       <w:headerReference w:type="default" r:id="rId9"/>
@@ -2007,7 +2754,7 @@
       <w:lvlText w:val="%1"/>
       <w:lvlJc w:val="left"/>
       <w:pPr>
-        <w:ind w:left="0"/>
+        <w:ind w:left="142"/>
       </w:pPr>
       <w:rPr>
         <w:rFonts w:ascii="Calibri" w:eastAsia="Calibri" w:hAnsi="Calibri" w:cs="Calibri"/>
@@ -2866,6 +3613,29 @@
       <w:sz w:val="29"/>
     </w:rPr>
   </w:style>
+  <w:style w:type="paragraph" w:styleId="Ttulo2">
+    <w:name w:val="heading 2"/>
+    <w:basedOn w:val="Normal"/>
+    <w:next w:val="Normal"/>
+    <w:link w:val="Ttulo2Car"/>
+    <w:uiPriority w:val="9"/>
+    <w:semiHidden/>
+    <w:unhideWhenUsed/>
+    <w:qFormat/>
+    <w:rsid w:val="00EF5E83"/>
+    <w:pPr>
+      <w:keepNext/>
+      <w:keepLines/>
+      <w:spacing w:before="40" w:after="0"/>
+      <w:outlineLvl w:val="1"/>
+    </w:pPr>
+    <w:rPr>
+      <w:rFonts w:asciiTheme="majorHAnsi" w:eastAsiaTheme="majorEastAsia" w:hAnsiTheme="majorHAnsi" w:cstheme="majorBidi"/>
+      <w:color w:val="0F4761" w:themeColor="accent1" w:themeShade="BF"/>
+      <w:sz w:val="26"/>
+      <w:szCs w:val="26"/>
+    </w:rPr>
+  </w:style>
   <w:style w:type="character" w:default="1" w:styleId="Fuentedeprrafopredeter">
     <w:name w:val="Default Paragraph Font"/>
     <w:uiPriority w:val="1"/>
@@ -2923,6 +3693,20 @@
     <w:rsid w:val="00E4024D"/>
     <w:rPr>
       <w:color w:val="666666"/>
+    </w:rPr>
+  </w:style>
+  <w:style w:type="character" w:customStyle="1" w:styleId="Ttulo2Car">
+    <w:name w:val="Título 2 Car"/>
+    <w:basedOn w:val="Fuentedeprrafopredeter"/>
+    <w:link w:val="Ttulo2"/>
+    <w:uiPriority w:val="9"/>
+    <w:semiHidden/>
+    <w:rsid w:val="00EF5E83"/>
+    <w:rPr>
+      <w:rFonts w:asciiTheme="majorHAnsi" w:eastAsiaTheme="majorEastAsia" w:hAnsiTheme="majorHAnsi" w:cstheme="majorBidi"/>
+      <w:color w:val="0F4761" w:themeColor="accent1" w:themeShade="BF"/>
+      <w:sz w:val="26"/>
+      <w:szCs w:val="26"/>
     </w:rPr>
   </w:style>
 </w:styles>
@@ -3009,9 +3793,9 @@
   </w:compat>
   <w:rsids>
     <w:rsidRoot w:val="00E074D3"/>
-    <w:rsid w:val="00296926"/>
     <w:rsid w:val="00912EEB"/>
     <w:rsid w:val="00E074D3"/>
+    <w:rsid w:val="00EB06C4"/>
   </w:rsids>
   <m:mathPr>
     <m:mathFont m:val="Cambria Math"/>
@@ -3813,8 +4597,8 @@
   </we:alternateReferences>
   <we:properties>
     <we:property name="MENDELEY_BIBLIOGRAPHY_IS_DIRTY" value="false"/>
-    <we:property name="MENDELEY_BIBLIOGRAPHY_LAST_MODIFIED" value="1784239802220"/>
-    <we:property name="MENDELEY_CITATIONS" value="[{&quot;citationID&quot;:&quot;MENDELEY_CITATION_cbaa5770-f04b-43bc-88b3-1745ece311b1&quot;,&quot;properties&quot;:{&quot;noteIndex&quot;:0},&quot;isEdited&quot;:false,&quot;manualOverride&quot;:{&quot;isManuallyOverridden&quot;:false,&quot;citeprocText&quot;:&quot;[1]&quot;,&quot;manualOverrideText&quot;:&quot;&quot;},&quot;citationTag&quot;:&quot;MENDELEY_CITATION_v3_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&quot;,&quot;citationItems&quot;:[{&quot;id&quot;:&quot;5246948d-a9a1-3347-bd4f-626648939cac&quot;,&quot;itemData&quot;:{&quot;type&quot;:&quot;webpage&quot;,&quot;id&quot;:&quot;5246948d-a9a1-3347-bd4f-626648939cac&quot;,&quot;title&quot;:&quot;Jakarta Servlet&quot;,&quot;author&quot;:[{&quot;family&quot;:&quot;Eclipse Foundation&quot;,&quot;given&quot;:&quot;&quot;,&quot;parse-names&quot;:false,&quot;dropping-particle&quot;:&quot;&quot;,&quot;non-dropping-particle&quot;:&quot;&quot;}],&quot;accessed&quot;:{&quot;date-parts&quot;:[[2026,7,15]]},&quot;URL&quot;:&quot;https://jakarta.ee/learn/docs/jakartaee-tutorial/current/web/servlets/servlets.html&quot;,&quot;container-title-short&quot;:&quot;&quot;},&quot;isTemporary&quot;:false,&quot;suppress-author&quot;:false,&quot;composite&quot;:false,&quot;author-only&quot;:false}]},{&quot;citationID&quot;:&quot;MENDELEY_CITATION_8adb0b72-409f-461e-8b00-d24574021135&quot;,&quot;properties&quot;:{&quot;noteIndex&quot;:0},&quot;isEdited&quot;:false,&quot;manualOverride&quot;:{&quot;isManuallyOverridden&quot;:false,&quot;citeprocText&quot;:&quot;[2]&quot;,&quot;manualOverrideText&quot;:&quot;&quot;},&quot;citationTag&quot;:&quot;MENDELEY_CITATION_v3_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&quot;,&quot;citationItems&quot;:[{&quot;id&quot;:&quot;a61821f4-1e99-38a1-86f5-3afdba1da3a6&quot;,&quot;itemData&quot;:{&quot;type&quot;:&quot;webpage&quot;,&quot;id&quot;:&quot;a61821f4-1e99-38a1-86f5-3afdba1da3a6&quot;,&quot;title&quot;:&quot;Superglobals&quot;,&quot;author&quot;:[{&quot;family&quot;:&quot;The PHP Group&quot;,&quot;given&quot;:&quot;&quot;,&quot;parse-names&quot;:false,&quot;dropping-particle&quot;:&quot;&quot;,&quot;non-dropping-particle&quot;:&quot;&quot;}],&quot;accessed&quot;:{&quot;date-parts&quot;:[[2026,7,15]]},&quot;URL&quot;:&quot;https://www.php.net/manual/en/language.variables.superglobals.php&quot;,&quot;container-title-short&quot;:&quot;&quot;},&quot;isTemporary&quot;:false,&quot;suppress-author&quot;:false,&quot;composite&quot;:false,&quot;author-only&quot;:false}]},{&quot;citationID&quot;:&quot;MENDELEY_CITATION_1e4da306-d171-44f0-8ccf-97b236f521d6&quot;,&quot;properties&quot;:{&quot;noteIndex&quot;:0},&quot;isEdited&quot;:false,&quot;manualOverride&quot;:{&quot;isManuallyOverridden&quot;:false,&quot;citeprocText&quot;:&quot;[1]&quot;,&quot;manualOverrideText&quot;:&quot;&quot;},&quot;citationTag&quot;:&quot;MENDELEY_CITATION_v3_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&quot;,&quot;citationItems&quot;:[{&quot;id&quot;:&quot;5246948d-a9a1-3347-bd4f-626648939cac&quot;,&quot;itemData&quot;:{&quot;type&quot;:&quot;webpage&quot;,&quot;id&quot;:&quot;5246948d-a9a1-3347-bd4f-626648939cac&quot;,&quot;title&quot;:&quot;Jakarta Servlet&quot;,&quot;author&quot;:[{&quot;family&quot;:&quot;Eclipse Foundation&quot;,&quot;given&quot;:&quot;&quot;,&quot;parse-names&quot;:false,&quot;dropping-particle&quot;:&quot;&quot;,&quot;non-dropping-particle&quot;:&quot;&quot;}],&quot;accessed&quot;:{&quot;date-parts&quot;:[[2026,7,15]]},&quot;URL&quot;:&quot;https://jakarta.ee/learn/docs/jakartaee-tutorial/current/web/servlets/servlets.html&quot;,&quot;container-title-short&quot;:&quot;&quot;},&quot;isTemporary&quot;:false,&quot;suppress-author&quot;:false,&quot;composite&quot;:false,&quot;author-only&quot;:false}]},{&quot;citationID&quot;:&quot;MENDELEY_CITATION_84be9df0-ec47-42fa-8e5e-a3ee77241e57&quot;,&quot;properties&quot;:{&quot;noteIndex&quot;:0},&quot;isEdited&quot;:false,&quot;manualOverride&quot;:{&quot;isManuallyOverridden&quot;:false,&quot;citeprocText&quot;:&quot;[3]&quot;,&quot;manualOverrideText&quot;:&quot;&quot;},&quot;citationTag&quot;:&quot;MENDELEY_CITATION_v3_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&quot;,&quot;citationItems&quot;:[{&quot;id&quot;:&quot;c8fe192c-4200-321d-8565-c1bfad8d7212&quot;,&quot;itemData&quot;:{&quot;type&quot;:&quot;webpage&quot;,&quot;id&quot;:&quot;c8fe192c-4200-321d-8565-c1bfad8d7212&quot;,&quot;title&quot;:&quot;Session and app state in ASP.NET Core&quot;,&quot;author&quot;:[{&quot;family&quot;:&quot;Microsoft&quot;,&quot;given&quot;:&quot;&quot;,&quot;parse-names&quot;:false,&quot;dropping-particle&quot;:&quot;&quot;,&quot;non-dropping-particle&quot;:&quot;&quot;}],&quot;accessed&quot;:{&quot;date-parts&quot;:[[2026,7,15]]},&quot;URL&quot;:&quot;https://learn.microsoft.com/en-us/aspnet/core/fundamentals/app-state?view=aspnetcore-10.0&quot;,&quot;container-title-short&quot;:&quot;&quot;},&quot;isTemporary&quot;:false,&quot;suppress-author&quot;:false,&quot;composite&quot;:false,&quot;author-only&quot;:false}]},{&quot;citationID&quot;:&quot;MENDELEY_CITATION_bb0cb89d-82c6-4e01-bce6-f8adc5fed633&quot;,&quot;properties&quot;:{&quot;noteIndex&quot;:0},&quot;isEdited&quot;:false,&quot;manualOverride&quot;:{&quot;isManuallyOverridden&quot;:false,&quot;citeprocText&quot;:&quot;[3]&quot;,&quot;manualOverrideText&quot;:&quot;&quot;},&quot;citationTag&quot;:&quot;MENDELEY_CITATION_v3_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&quot;,&quot;citationItems&quot;:[{&quot;id&quot;:&quot;c8fe192c-4200-321d-8565-c1bfad8d7212&quot;,&quot;itemData&quot;:{&quot;type&quot;:&quot;webpage&quot;,&quot;id&quot;:&quot;c8fe192c-4200-321d-8565-c1bfad8d7212&quot;,&quot;title&quot;:&quot;Session and app state in ASP.NET Core&quot;,&quot;author&quot;:[{&quot;family&quot;:&quot;Microsoft&quot;,&quot;given&quot;:&quot;&quot;,&quot;parse-names&quot;:false,&quot;dropping-particle&quot;:&quot;&quot;,&quot;non-dropping-particle&quot;:&quot;&quot;}],&quot;accessed&quot;:{&quot;date-parts&quot;:[[2026,7,15]]},&quot;URL&quot;:&quot;https://learn.microsoft.com/en-us/aspnet/core/fundamentals/app-state?view=aspnetcore-10.0&quot;,&quot;container-title-short&quot;:&quot;&quot;},&quot;isTemporary&quot;:false,&quot;suppress-author&quot;:false,&quot;composite&quot;:false,&quot;author-only&quot;:false}]},{&quot;citationID&quot;:&quot;MENDELEY_CITATION_72ff4076-a3b9-4da3-ba08-6bb61c005f1f&quot;,&quot;properties&quot;:{&quot;noteIndex&quot;:0},&quot;isEdited&quot;:false,&quot;manualOverride&quot;:{&quot;isManuallyOverridden&quot;:false,&quot;citeprocText&quot;:&quot;[1]&quot;,&quot;manualOverrideText&quot;:&quot;&quot;},&quot;citationTag&quot;:&quot;MENDELEY_CITATION_v3_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&quot;,&quot;citationItems&quot;:[{&quot;id&quot;:&quot;5246948d-a9a1-3347-bd4f-626648939cac&quot;,&quot;itemData&quot;:{&quot;type&quot;:&quot;webpage&quot;,&quot;id&quot;:&quot;5246948d-a9a1-3347-bd4f-626648939cac&quot;,&quot;title&quot;:&quot;Jakarta Servlet&quot;,&quot;author&quot;:[{&quot;family&quot;:&quot;Eclipse Foundation&quot;,&quot;given&quot;:&quot;&quot;,&quot;parse-names&quot;:false,&quot;dropping-particle&quot;:&quot;&quot;,&quot;non-dropping-particle&quot;:&quot;&quot;}],&quot;accessed&quot;:{&quot;date-parts&quot;:[[2026,7,15]]},&quot;URL&quot;:&quot;https://jakarta.ee/learn/docs/jakartaee-tutorial/current/web/servlets/servlets.html&quot;,&quot;container-title-short&quot;:&quot;&quot;},&quot;isTemporary&quot;:false,&quot;suppress-author&quot;:false,&quot;composite&quot;:false,&quot;author-only&quot;:false}]},{&quot;citationID&quot;:&quot;MENDELEY_CITATION_f0836816-6ef3-4924-8f4f-094d8fb8c244&quot;,&quot;properties&quot;:{&quot;noteIndex&quot;:0},&quot;isEdited&quot;:false,&quot;manualOverride&quot;:{&quot;isManuallyOverridden&quot;:false,&quot;citeprocText&quot;:&quot;[2]&quot;,&quot;manualOverrideText&quot;:&quot;&quot;},&quot;citationTag&quot;:&quot;MENDELEY_CITATION_v3_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&quot;,&quot;citationItems&quot;:[{&quot;id&quot;:&quot;a61821f4-1e99-38a1-86f5-3afdba1da3a6&quot;,&quot;itemData&quot;:{&quot;type&quot;:&quot;webpage&quot;,&quot;id&quot;:&quot;a61821f4-1e99-38a1-86f5-3afdba1da3a6&quot;,&quot;title&quot;:&quot;Superglobals&quot;,&quot;author&quot;:[{&quot;family&quot;:&quot;The PHP Group&quot;,&quot;given&quot;:&quot;&quot;,&quot;parse-names&quot;:false,&quot;dropping-particle&quot;:&quot;&quot;,&quot;non-dropping-particle&quot;:&quot;&quot;}],&quot;accessed&quot;:{&quot;date-parts&quot;:[[2026,7,15]]},&quot;URL&quot;:&quot;https://www.php.net/manual/en/language.variables.superglobals.php&quot;,&quot;container-title-short&quot;:&quot;&quot;},&quot;isTemporary&quot;:false,&quot;suppress-author&quot;:false,&quot;composite&quot;:false,&quot;author-only&quot;:false}]},{&quot;citationID&quot;:&quot;MENDELEY_CITATION_8f8ae8bc-86d0-4c81-bb20-a7faf28f0183&quot;,&quot;properties&quot;:{&quot;noteIndex&quot;:0},&quot;isEdited&quot;:false,&quot;manualOverride&quot;:{&quot;isManuallyOverridden&quot;:false,&quot;citeprocText&quot;:&quot;[3]&quot;,&quot;manualOverrideText&quot;:&quot;&quot;},&quot;citationTag&quot;:&quot;MENDELEY_CITATION_v3_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&quot;,&quot;citationItems&quot;:[{&quot;id&quot;:&quot;c8fe192c-4200-321d-8565-c1bfad8d7212&quot;,&quot;itemData&quot;:{&quot;type&quot;:&quot;webpage&quot;,&quot;id&quot;:&quot;c8fe192c-4200-321d-8565-c1bfad8d7212&quot;,&quot;title&quot;:&quot;Session and app state in ASP.NET Core&quot;,&quot;author&quot;:[{&quot;family&quot;:&quot;Microsoft&quot;,&quot;given&quot;:&quot;&quot;,&quot;parse-names&quot;:false,&quot;dropping-particle&quot;:&quot;&quot;,&quot;non-dropping-particle&quot;:&quot;&quot;}],&quot;accessed&quot;:{&quot;date-parts&quot;:[[2026,7,15]]},&quot;URL&quot;:&quot;https://learn.microsoft.com/en-us/aspnet/core/fundamentals/app-state?view=aspnetcore-10.0&quot;,&quot;container-title-short&quot;:&quot;&quot;},&quot;isTemporary&quot;:false,&quot;suppress-author&quot;:false,&quot;composite&quot;:false,&quot;author-only&quot;:false}]},{&quot;citationID&quot;:&quot;MENDELEY_CITATION_4685483d-742a-45c0-ad4e-6b636e487447&quot;,&quot;properties&quot;:{&quot;noteIndex&quot;:0},&quot;isEdited&quot;:false,&quot;manualOverride&quot;:{&quot;isManuallyOverridden&quot;:false,&quot;citeprocText&quot;:&quot;[3]&quot;,&quot;manualOverrideText&quot;:&quot;&quot;},&quot;citationTag&quot;:&quot;MENDELEY_CITATION_v3_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&quot;,&quot;citationItems&quot;:[{&quot;id&quot;:&quot;c8fe192c-4200-321d-8565-c1bfad8d7212&quot;,&quot;itemData&quot;:{&quot;type&quot;:&quot;webpage&quot;,&quot;id&quot;:&quot;c8fe192c-4200-321d-8565-c1bfad8d7212&quot;,&quot;title&quot;:&quot;Session and app state in ASP.NET Core&quot;,&quot;author&quot;:[{&quot;family&quot;:&quot;Microsoft&quot;,&quot;given&quot;:&quot;&quot;,&quot;parse-names&quot;:false,&quot;dropping-particle&quot;:&quot;&quot;,&quot;non-dropping-particle&quot;:&quot;&quot;}],&quot;accessed&quot;:{&quot;date-parts&quot;:[[2026,7,15]]},&quot;URL&quot;:&quot;https://learn.microsoft.com/en-us/aspnet/core/fundamentals/app-state?view=aspnetcore-10.0&quot;,&quot;container-title-short&quot;:&quot;&quot;},&quot;isTemporary&quot;:false,&quot;suppress-author&quot;:false,&quot;composite&quot;:false,&quot;author-only&quot;:false}]},{&quot;citationID&quot;:&quot;MENDELEY_CITATION_2b1ded95-e485-4651-a2c3-d797da679752&quot;,&quot;properties&quot;:{&quot;noteIndex&quot;:0},&quot;isEdited&quot;:false,&quot;manualOverride&quot;:{&quot;isManuallyOverridden&quot;:false,&quot;citeprocText&quot;:&quot;[3]&quot;,&quot;manualOverrideText&quot;:&quot;&quot;},&quot;citationTag&quot;:&quot;MENDELEY_CITATION_v3_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&quot;,&quot;citationItems&quot;:[{&quot;id&quot;:&quot;c8fe192c-4200-321d-8565-c1bfad8d7212&quot;,&quot;itemData&quot;:{&quot;type&quot;:&quot;webpage&quot;,&quot;id&quot;:&quot;c8fe192c-4200-321d-8565-c1bfad8d7212&quot;,&quot;title&quot;:&quot;Session and app state in ASP.NET Core&quot;,&quot;author&quot;:[{&quot;family&quot;:&quot;Microsoft&quot;,&quot;given&quot;:&quot;&quot;,&quot;parse-names&quot;:false,&quot;dropping-particle&quot;:&quot;&quot;,&quot;non-dropping-particle&quot;:&quot;&quot;}],&quot;accessed&quot;:{&quot;date-parts&quot;:[[2026,7,15]]},&quot;URL&quot;:&quot;https://learn.microsoft.com/en-us/aspnet/core/fundamentals/app-state?view=aspnetcore-10.0&quot;,&quot;container-title-short&quot;:&quot;&quot;},&quot;isTemporary&quot;:false,&quot;suppress-author&quot;:false,&quot;composite&quot;:false,&quot;author-only&quot;:false}]},{&quot;citationID&quot;:&quot;MENDELEY_CITATION_6086a87d-27f2-4867-8024-31e37d2f36a1&quot;,&quot;properties&quot;:{&quot;noteIndex&quot;:0},&quot;isEdited&quot;:false,&quot;manualOverride&quot;:{&quot;isManuallyOverridden&quot;:false,&quot;citeprocText&quot;:&quot;[1]&quot;,&quot;manualOverrideText&quot;:&quot;&quot;},&quot;citationTag&quot;:&quot;MENDELEY_CITATION_v3_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&quot;,&quot;citationItems&quot;:[{&quot;id&quot;:&quot;5246948d-a9a1-3347-bd4f-626648939cac&quot;,&quot;itemData&quot;:{&quot;type&quot;:&quot;webpage&quot;,&quot;id&quot;:&quot;5246948d-a9a1-3347-bd4f-626648939cac&quot;,&quot;title&quot;:&quot;Jakarta Servlet&quot;,&quot;author&quot;:[{&quot;family&quot;:&quot;Eclipse Foundation&quot;,&quot;given&quot;:&quot;&quot;,&quot;parse-names&quot;:false,&quot;dropping-particle&quot;:&quot;&quot;,&quot;non-dropping-particle&quot;:&quot;&quot;}],&quot;accessed&quot;:{&quot;date-parts&quot;:[[2026,7,15]]},&quot;URL&quot;:&quot;https://jakarta.ee/learn/docs/jakartaee-tutorial/current/web/servlets/servlets.html&quot;,&quot;container-title-short&quot;:&quot;&quot;},&quot;isTemporary&quot;:false,&quot;suppress-author&quot;:false,&quot;composite&quot;:false,&quot;author-only&quot;:false}]}]"/>
+    <we:property name="MENDELEY_BIBLIOGRAPHY_LAST_MODIFIED" value="1784241716767"/>
+    <we:property name="MENDELEY_CITATIONS" value="[{&quot;citationID&quot;:&quot;MENDELEY_CITATION_cbaa5770-f04b-43bc-88b3-1745ece311b1&quot;,&quot;properties&quot;:{&quot;noteIndex&quot;:0},&quot;isEdited&quot;:false,&quot;manualOverride&quot;:{&quot;isManuallyOverridden&quot;:false,&quot;citeprocText&quot;:&quot;[1]&quot;,&quot;manualOverrideText&quot;:&quot;&quot;},&quot;citationTag&quot;:&quot;MENDELEY_CITATION_v3_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&quot;,&quot;citationItems&quot;:[{&quot;id&quot;:&quot;5246948d-a9a1-3347-bd4f-626648939cac&quot;,&quot;itemData&quot;:{&quot;type&quot;:&quot;webpage&quot;,&quot;id&quot;:&quot;5246948d-a9a1-3347-bd4f-626648939cac&quot;,&quot;title&quot;:&quot;Jakarta Servlet&quot;,&quot;author&quot;:[{&quot;family&quot;:&quot;Eclipse Foundation&quot;,&quot;given&quot;:&quot;&quot;,&quot;parse-names&quot;:false,&quot;dropping-particle&quot;:&quot;&quot;,&quot;non-dropping-particle&quot;:&quot;&quot;}],&quot;accessed&quot;:{&quot;date-parts&quot;:[[2026,7,15]]},&quot;URL&quot;:&quot;https://jakarta.ee/learn/docs/jakartaee-tutorial/current/web/servlets/servlets.html&quot;,&quot;container-title-short&quot;:&quot;&quot;},&quot;isTemporary&quot;:false,&quot;suppress-author&quot;:false,&quot;composite&quot;:false,&quot;author-only&quot;:false}]},{&quot;citationID&quot;:&quot;MENDELEY_CITATION_8adb0b72-409f-461e-8b00-d24574021135&quot;,&quot;properties&quot;:{&quot;noteIndex&quot;:0},&quot;isEdited&quot;:false,&quot;manualOverride&quot;:{&quot;isManuallyOverridden&quot;:false,&quot;citeprocText&quot;:&quot;[2]&quot;,&quot;manualOverrideText&quot;:&quot;&quot;},&quot;citationTag&quot;:&quot;MENDELEY_CITATION_v3_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&quot;,&quot;citationItems&quot;:[{&quot;id&quot;:&quot;a61821f4-1e99-38a1-86f5-3afdba1da3a6&quot;,&quot;itemData&quot;:{&quot;type&quot;:&quot;webpage&quot;,&quot;id&quot;:&quot;a61821f4-1e99-38a1-86f5-3afdba1da3a6&quot;,&quot;title&quot;:&quot;Superglobals&quot;,&quot;author&quot;:[{&quot;family&quot;:&quot;The PHP Group&quot;,&quot;given&quot;:&quot;&quot;,&quot;parse-names&quot;:false,&quot;dropping-particle&quot;:&quot;&quot;,&quot;non-dropping-particle&quot;:&quot;&quot;}],&quot;accessed&quot;:{&quot;date-parts&quot;:[[2026,7,15]]},&quot;URL&quot;:&quot;https://www.php.net/manual/en/language.variables.superglobals.php&quot;,&quot;container-title-short&quot;:&quot;&quot;},&quot;isTemporary&quot;:false,&quot;suppress-author&quot;:false,&quot;composite&quot;:false,&quot;author-only&quot;:false}]},{&quot;citationID&quot;:&quot;MENDELEY_CITATION_1e4da306-d171-44f0-8ccf-97b236f521d6&quot;,&quot;properties&quot;:{&quot;noteIndex&quot;:0},&quot;isEdited&quot;:false,&quot;manualOverride&quot;:{&quot;isManuallyOverridden&quot;:false,&quot;citeprocText&quot;:&quot;[1]&quot;,&quot;manualOverrideText&quot;:&quot;&quot;},&quot;citationTag&quot;:&quot;MENDELEY_CITATION_v3_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&quot;,&quot;citationItems&quot;:[{&quot;id&quot;:&quot;5246948d-a9a1-3347-bd4f-626648939cac&quot;,&quot;itemData&quot;:{&quot;type&quot;:&quot;webpage&quot;,&quot;id&quot;:&quot;5246948d-a9a1-3347-bd4f-626648939cac&quot;,&quot;title&quot;:&quot;Jakarta Servlet&quot;,&quot;author&quot;:[{&quot;family&quot;:&quot;Eclipse Foundation&quot;,&quot;given&quot;:&quot;&quot;,&quot;parse-names&quot;:false,&quot;dropping-particle&quot;:&quot;&quot;,&quot;non-dropping-particle&quot;:&quot;&quot;}],&quot;accessed&quot;:{&quot;date-parts&quot;:[[2026,7,15]]},&quot;URL&quot;:&quot;https://jakarta.ee/learn/docs/jakartaee-tutorial/current/web/servlets/servlets.html&quot;,&quot;container-title-short&quot;:&quot;&quot;},&quot;isTemporary&quot;:false,&quot;suppress-author&quot;:false,&quot;composite&quot;:false,&quot;author-only&quot;:false}]},{&quot;citationID&quot;:&quot;MENDELEY_CITATION_84be9df0-ec47-42fa-8e5e-a3ee77241e57&quot;,&quot;properties&quot;:{&quot;noteIndex&quot;:0},&quot;isEdited&quot;:false,&quot;manualOverride&quot;:{&quot;isManuallyOverridden&quot;:false,&quot;citeprocText&quot;:&quot;[3]&quot;,&quot;manualOverrideText&quot;:&quot;&quot;},&quot;citationTag&quot;:&quot;MENDELEY_CITATION_v3_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&quot;,&quot;citationItems&quot;:[{&quot;id&quot;:&quot;c8fe192c-4200-321d-8565-c1bfad8d7212&quot;,&quot;itemData&quot;:{&quot;type&quot;:&quot;webpage&quot;,&quot;id&quot;:&quot;c8fe192c-4200-321d-8565-c1bfad8d7212&quot;,&quot;title&quot;:&quot;Session and app state in ASP.NET Core&quot;,&quot;author&quot;:[{&quot;family&quot;:&quot;Microsoft&quot;,&quot;given&quot;:&quot;&quot;,&quot;parse-names&quot;:false,&quot;dropping-particle&quot;:&quot;&quot;,&quot;non-dropping-particle&quot;:&quot;&quot;}],&quot;accessed&quot;:{&quot;date-parts&quot;:[[2026,7,15]]},&quot;URL&quot;:&quot;https://learn.microsoft.com/en-us/aspnet/core/fundamentals/app-state?view=aspnetcore-10.0&quot;,&quot;container-title-short&quot;:&quot;&quot;},&quot;isTemporary&quot;:false,&quot;suppress-author&quot;:false,&quot;composite&quot;:false,&quot;author-only&quot;:false}]},{&quot;citationID&quot;:&quot;MENDELEY_CITATION_bb0cb89d-82c6-4e01-bce6-f8adc5fed633&quot;,&quot;properties&quot;:{&quot;noteIndex&quot;:0},&quot;isEdited&quot;:false,&quot;manualOverride&quot;:{&quot;isManuallyOverridden&quot;:false,&quot;citeprocText&quot;:&quot;[3]&quot;,&quot;manualOverrideText&quot;:&quot;&quot;},&quot;citationTag&quot;:&quot;MENDELEY_CITATION_v3_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&quot;,&quot;citationItems&quot;:[{&quot;id&quot;:&quot;c8fe192c-4200-321d-8565-c1bfad8d7212&quot;,&quot;itemData&quot;:{&quot;type&quot;:&quot;webpage&quot;,&quot;id&quot;:&quot;c8fe192c-4200-321d-8565-c1bfad8d7212&quot;,&quot;title&quot;:&quot;Session and app state in ASP.NET Core&quot;,&quot;author&quot;:[{&quot;family&quot;:&quot;Microsoft&quot;,&quot;given&quot;:&quot;&quot;,&quot;parse-names&quot;:false,&quot;dropping-particle&quot;:&quot;&quot;,&quot;non-dropping-particle&quot;:&quot;&quot;}],&quot;accessed&quot;:{&quot;date-parts&quot;:[[2026,7,15]]},&quot;URL&quot;:&quot;https://learn.microsoft.com/en-us/aspnet/core/fundamentals/app-state?view=aspnetcore-10.0&quot;,&quot;container-title-short&quot;:&quot;&quot;},&quot;isTemporary&quot;:false,&quot;suppress-author&quot;:false,&quot;composite&quot;:false,&quot;author-only&quot;:false}]},{&quot;citationID&quot;:&quot;MENDELEY_CITATION_72ff4076-a3b9-4da3-ba08-6bb61c005f1f&quot;,&quot;properties&quot;:{&quot;noteIndex&quot;:0},&quot;isEdited&quot;:false,&quot;manualOverride&quot;:{&quot;isManuallyOverridden&quot;:false,&quot;citeprocText&quot;:&quot;[1]&quot;,&quot;manualOverrideText&quot;:&quot;&quot;},&quot;citationTag&quot;:&quot;MENDELEY_CITATION_v3_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&quot;,&quot;citationItems&quot;:[{&quot;id&quot;:&quot;5246948d-a9a1-3347-bd4f-626648939cac&quot;,&quot;itemData&quot;:{&quot;type&quot;:&quot;webpage&quot;,&quot;id&quot;:&quot;5246948d-a9a1-3347-bd4f-626648939cac&quot;,&quot;title&quot;:&quot;Jakarta Servlet&quot;,&quot;author&quot;:[{&quot;family&quot;:&quot;Eclipse Foundation&quot;,&quot;given&quot;:&quot;&quot;,&quot;parse-names&quot;:false,&quot;dropping-particle&quot;:&quot;&quot;,&quot;non-dropping-particle&quot;:&quot;&quot;}],&quot;accessed&quot;:{&quot;date-parts&quot;:[[2026,7,15]]},&quot;URL&quot;:&quot;https://jakarta.ee/learn/docs/jakartaee-tutorial/current/web/servlets/servlets.html&quot;,&quot;container-title-short&quot;:&quot;&quot;},&quot;isTemporary&quot;:false,&quot;suppress-author&quot;:false,&quot;composite&quot;:false,&quot;author-only&quot;:false}]},{&quot;citationID&quot;:&quot;MENDELEY_CITATION_f0836816-6ef3-4924-8f4f-094d8fb8c244&quot;,&quot;properties&quot;:{&quot;noteIndex&quot;:0},&quot;isEdited&quot;:false,&quot;manualOverride&quot;:{&quot;isManuallyOverridden&quot;:false,&quot;citeprocText&quot;:&quot;[2]&quot;,&quot;manualOverrideText&quot;:&quot;&quot;},&quot;citationTag&quot;:&quot;MENDELEY_CITATION_v3_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&quot;,&quot;citationItems&quot;:[{&quot;id&quot;:&quot;a61821f4-1e99-38a1-86f5-3afdba1da3a6&quot;,&quot;itemData&quot;:{&quot;type&quot;:&quot;webpage&quot;,&quot;id&quot;:&quot;a61821f4-1e99-38a1-86f5-3afdba1da3a6&quot;,&quot;title&quot;:&quot;Superglobals&quot;,&quot;author&quot;:[{&quot;family&quot;:&quot;The PHP Group&quot;,&quot;given&quot;:&quot;&quot;,&quot;parse-names&quot;:false,&quot;dropping-particle&quot;:&quot;&quot;,&quot;non-dropping-particle&quot;:&quot;&quot;}],&quot;accessed&quot;:{&quot;date-parts&quot;:[[2026,7,15]]},&quot;URL&quot;:&quot;https://www.php.net/manual/en/language.variables.superglobals.php&quot;,&quot;container-title-short&quot;:&quot;&quot;},&quot;isTemporary&quot;:false,&quot;suppress-author&quot;:false,&quot;composite&quot;:false,&quot;author-only&quot;:false}]},{&quot;citationID&quot;:&quot;MENDELEY_CITATION_8f8ae8bc-86d0-4c81-bb20-a7faf28f0183&quot;,&quot;properties&quot;:{&quot;noteIndex&quot;:0},&quot;isEdited&quot;:false,&quot;manualOverride&quot;:{&quot;isManuallyOverridden&quot;:false,&quot;citeprocText&quot;:&quot;[3]&quot;,&quot;manualOverrideText&quot;:&quot;&quot;},&quot;citationTag&quot;:&quot;MENDELEY_CITATION_v3_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&quot;,&quot;citationItems&quot;:[{&quot;id&quot;:&quot;c8fe192c-4200-321d-8565-c1bfad8d7212&quot;,&quot;itemData&quot;:{&quot;type&quot;:&quot;webpage&quot;,&quot;id&quot;:&quot;c8fe192c-4200-321d-8565-c1bfad8d7212&quot;,&quot;title&quot;:&quot;Session and app state in ASP.NET Core&quot;,&quot;author&quot;:[{&quot;family&quot;:&quot;Microsoft&quot;,&quot;given&quot;:&quot;&quot;,&quot;parse-names&quot;:false,&quot;dropping-particle&quot;:&quot;&quot;,&quot;non-dropping-particle&quot;:&quot;&quot;}],&quot;accessed&quot;:{&quot;date-parts&quot;:[[2026,7,15]]},&quot;URL&quot;:&quot;https://learn.microsoft.com/en-us/aspnet/core/fundamentals/app-state?view=aspnetcore-10.0&quot;,&quot;container-title-short&quot;:&quot;&quot;},&quot;isTemporary&quot;:false,&quot;suppress-author&quot;:false,&quot;composite&quot;:false,&quot;author-only&quot;:false}]},{&quot;citationID&quot;:&quot;MENDELEY_CITATION_4685483d-742a-45c0-ad4e-6b636e487447&quot;,&quot;properties&quot;:{&quot;noteIndex&quot;:0},&quot;isEdited&quot;:false,&quot;manualOverride&quot;:{&quot;isManuallyOverridden&quot;:false,&quot;citeprocText&quot;:&quot;[3]&quot;,&quot;manualOverrideText&quot;:&quot;&quot;},&quot;citationTag&quot;:&quot;MENDELEY_CITATION_v3_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&quot;,&quot;citationItems&quot;:[{&quot;id&quot;:&quot;c8fe192c-4200-321d-8565-c1bfad8d7212&quot;,&quot;itemData&quot;:{&quot;type&quot;:&quot;webpage&quot;,&quot;id&quot;:&quot;c8fe192c-4200-321d-8565-c1bfad8d7212&quot;,&quot;title&quot;:&quot;Session and app state in ASP.NET Core&quot;,&quot;author&quot;:[{&quot;family&quot;:&quot;Microsoft&quot;,&quot;given&quot;:&quot;&quot;,&quot;parse-names&quot;:false,&quot;dropping-particle&quot;:&quot;&quot;,&quot;non-dropping-particle&quot;:&quot;&quot;}],&quot;accessed&quot;:{&quot;date-parts&quot;:[[2026,7,15]]},&quot;URL&quot;:&quot;https://learn.microsoft.com/en-us/aspnet/core/fundamentals/app-state?view=aspnetcore-10.0&quot;,&quot;container-title-short&quot;:&quot;&quot;},&quot;isTemporary&quot;:false,&quot;suppress-author&quot;:false,&quot;composite&quot;:false,&quot;author-only&quot;:false}]},{&quot;citationID&quot;:&quot;MENDELEY_CITATION_2b1ded95-e485-4651-a2c3-d797da679752&quot;,&quot;properties&quot;:{&quot;noteIndex&quot;:0},&quot;isEdited&quot;:false,&quot;manualOverride&quot;:{&quot;isManuallyOverridden&quot;:false,&quot;citeprocText&quot;:&quot;[3]&quot;,&quot;manualOverrideText&quot;:&quot;&quot;},&quot;citationTag&quot;:&quot;MENDELEY_CITATION_v3_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&quot;,&quot;citationItems&quot;:[{&quot;id&quot;:&quot;c8fe192c-4200-321d-8565-c1bfad8d7212&quot;,&quot;itemData&quot;:{&quot;type&quot;:&quot;webpage&quot;,&quot;id&quot;:&quot;c8fe192c-4200-321d-8565-c1bfad8d7212&quot;,&quot;title&quot;:&quot;Session and app state in ASP.NET Core&quot;,&quot;author&quot;:[{&quot;family&quot;:&quot;Microsoft&quot;,&quot;given&quot;:&quot;&quot;,&quot;parse-names&quot;:false,&quot;dropping-particle&quot;:&quot;&quot;,&quot;non-dropping-particle&quot;:&quot;&quot;}],&quot;accessed&quot;:{&quot;date-parts&quot;:[[2026,7,15]]},&quot;URL&quot;:&quot;https://learn.microsoft.com/en-us/aspnet/core/fundamentals/app-state?view=aspnetcore-10.0&quot;,&quot;container-title-short&quot;:&quot;&quot;},&quot;isTemporary&quot;:false,&quot;suppress-author&quot;:false,&quot;composite&quot;:false,&quot;author-only&quot;:false}]},{&quot;citationID&quot;:&quot;MENDELEY_CITATION_6086a87d-27f2-4867-8024-31e37d2f36a1&quot;,&quot;properties&quot;:{&quot;noteIndex&quot;:0},&quot;isEdited&quot;:false,&quot;manualOverride&quot;:{&quot;isManuallyOverridden&quot;:false,&quot;citeprocText&quot;:&quot;[1]&quot;,&quot;manualOverrideText&quot;:&quot;&quot;},&quot;citationTag&quot;:&quot;MENDELEY_CITATION_v3_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&quot;,&quot;citationItems&quot;:[{&quot;id&quot;:&quot;5246948d-a9a1-3347-bd4f-626648939cac&quot;,&quot;itemData&quot;:{&quot;type&quot;:&quot;webpage&quot;,&quot;id&quot;:&quot;5246948d-a9a1-3347-bd4f-626648939cac&quot;,&quot;title&quot;:&quot;Jakarta Servlet&quot;,&quot;author&quot;:[{&quot;family&quot;:&quot;Eclipse Foundation&quot;,&quot;given&quot;:&quot;&quot;,&quot;parse-names&quot;:false,&quot;dropping-particle&quot;:&quot;&quot;,&quot;non-dropping-particle&quot;:&quot;&quot;}],&quot;accessed&quot;:{&quot;date-parts&quot;:[[2026,7,15]]},&quot;URL&quot;:&quot;https://jakarta.ee/learn/docs/jakartaee-tutorial/current/web/servlets/servlets.html&quot;,&quot;container-title-short&quot;:&quot;&quot;},&quot;isTemporary&quot;:false,&quot;suppress-author&quot;:false,&quot;composite&quot;:false,&quot;author-only&quot;:false}]},{&quot;citationID&quot;:&quot;MENDELEY_CITATION_feef250f-b3a6-4c1f-b1a8-953ba99155d0&quot;,&quot;properties&quot;:{&quot;noteIndex&quot;:0},&quot;isEdited&quot;:false,&quot;manualOverride&quot;:{&quot;isManuallyOverridden&quot;:false,&quot;citeprocText&quot;:&quot;[4]&quot;,&quot;manualOverrideText&quot;:&quot;&quot;},&quot;citationTag&quot;:&quot;MENDELEY_CITATION_v3_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&quot;,&quot;citationItems&quot;:[{&quot;id&quot;:&quot;2341f895-6a0f-36fb-91bf-1dae3f2d0cc3&quot;,&quot;itemData&quot;:{&quot;type&quot;:&quot;webpage&quot;,&quot;id&quot;:&quot;2341f895-6a0f-36fb-91bf-1dae3f2d0cc3&quot;,&quot;title&quot;:&quot;Lesson: JDBC Basics&quot;,&quot;author&quot;:[{&quot;family&quot;:&quot;Oracle&quot;,&quot;given&quot;:&quot;&quot;,&quot;parse-names&quot;:false,&quot;dropping-particle&quot;:&quot;&quot;,&quot;non-dropping-particle&quot;:&quot;&quot;}],&quot;accessed&quot;:{&quot;date-parts&quot;:[[2026,7,15]]},&quot;URL&quot;:&quot;https://docs.oracle.com/javase/tutorial/jdbc/basics/index.html&quot;,&quot;container-title-short&quot;:&quot;&quot;},&quot;isTemporary&quot;:false,&quot;suppress-author&quot;:false,&quot;composite&quot;:false,&quot;author-only&quot;:false}]},{&quot;citationID&quot;:&quot;MENDELEY_CITATION_0f0059fd-8685-4145-b6b9-d5c29cf15c58&quot;,&quot;properties&quot;:{&quot;noteIndex&quot;:0},&quot;isEdited&quot;:false,&quot;manualOverride&quot;:{&quot;isManuallyOverridden&quot;:false,&quot;citeprocText&quot;:&quot;[5]&quot;,&quot;manualOverrideText&quot;:&quot;&quot;},&quot;citationTag&quot;:&quot;MENDELEY_CITATION_v3_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&quot;,&quot;citationItems&quot;:[{&quot;id&quot;:&quot;0f8126e1-8960-3687-8d78-ff0c3ec6c458&quot;,&quot;itemData&quot;:{&quot;type&quot;:&quot;webpage&quot;,&quot;id&quot;:&quot;0f8126e1-8960-3687-8d78-ff0c3ec6c458&quot;,&quot;title&quot;:&quot;PDO&quot;,&quot;author&quot;:[{&quot;family&quot;:&quot;The PHP Group&quot;,&quot;given&quot;:&quot;&quot;,&quot;parse-names&quot;:false,&quot;dropping-particle&quot;:&quot;&quot;,&quot;non-dropping-particle&quot;:&quot;&quot;}],&quot;accessed&quot;:{&quot;date-parts&quot;:[[2026,7,15]]},&quot;URL&quot;:&quot;https://www.php.net/manual/en/book.pdo.php&quot;,&quot;container-title-short&quot;:&quot;&quot;},&quot;isTemporary&quot;:false,&quot;suppress-author&quot;:false,&quot;composite&quot;:false,&quot;author-only&quot;:false}]},{&quot;citationID&quot;:&quot;MENDELEY_CITATION_9a109af2-7bf3-4044-98b4-f5125a1ce03f&quot;,&quot;properties&quot;:{&quot;noteIndex&quot;:0},&quot;isEdited&quot;:false,&quot;manualOverride&quot;:{&quot;isManuallyOverridden&quot;:false,&quot;citeprocText&quot;:&quot;[4]&quot;,&quot;manualOverrideText&quot;:&quot;&quot;},&quot;citationTag&quot;:&quot;MENDELEY_CITATION_v3_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&quot;,&quot;citationItems&quot;:[{&quot;id&quot;:&quot;2341f895-6a0f-36fb-91bf-1dae3f2d0cc3&quot;,&quot;itemData&quot;:{&quot;type&quot;:&quot;webpage&quot;,&quot;id&quot;:&quot;2341f895-6a0f-36fb-91bf-1dae3f2d0cc3&quot;,&quot;title&quot;:&quot;Lesson: JDBC Basics&quot;,&quot;author&quot;:[{&quot;family&quot;:&quot;Oracle&quot;,&quot;given&quot;:&quot;&quot;,&quot;parse-names&quot;:false,&quot;dropping-particle&quot;:&quot;&quot;,&quot;non-dropping-particle&quot;:&quot;&quot;}],&quot;accessed&quot;:{&quot;date-parts&quot;:[[2026,7,15]]},&quot;URL&quot;:&quot;https://docs.oracle.com/javase/tutorial/jdbc/basics/index.html&quot;,&quot;container-title-short&quot;:&quot;&quot;},&quot;isTemporary&quot;:false,&quot;suppress-author&quot;:false,&quot;composite&quot;:false,&quot;author-only&quot;:false}]},{&quot;citationID&quot;:&quot;MENDELEY_CITATION_6078f0b4-a7f1-4be5-82eb-a86385206db0&quot;,&quot;properties&quot;:{&quot;noteIndex&quot;:0},&quot;isEdited&quot;:false,&quot;manualOverride&quot;:{&quot;isManuallyOverridden&quot;:false,&quot;citeprocText&quot;:&quot;[5]&quot;,&quot;manualOverrideText&quot;:&quot;&quot;},&quot;citationTag&quot;:&quot;MENDELEY_CITATION_v3_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&quot;,&quot;citationItems&quot;:[{&quot;id&quot;:&quot;0f8126e1-8960-3687-8d78-ff0c3ec6c458&quot;,&quot;itemData&quot;:{&quot;type&quot;:&quot;webpage&quot;,&quot;id&quot;:&quot;0f8126e1-8960-3687-8d78-ff0c3ec6c458&quot;,&quot;title&quot;:&quot;PDO&quot;,&quot;author&quot;:[{&quot;family&quot;:&quot;The PHP Group&quot;,&quot;given&quot;:&quot;&quot;,&quot;parse-names&quot;:false,&quot;dropping-particle&quot;:&quot;&quot;,&quot;non-dropping-particle&quot;:&quot;&quot;}],&quot;accessed&quot;:{&quot;date-parts&quot;:[[2026,7,15]]},&quot;URL&quot;:&quot;https://www.php.net/manual/en/book.pdo.php&quot;,&quot;container-title-short&quot;:&quot;&quot;},&quot;isTemporary&quot;:false,&quot;suppress-author&quot;:false,&quot;composite&quot;:false,&quot;author-only&quot;:false}]},{&quot;citationID&quot;:&quot;MENDELEY_CITATION_2e03e530-e8fd-4d20-a43e-f7a2cf563431&quot;,&quot;properties&quot;:{&quot;noteIndex&quot;:0},&quot;isEdited&quot;:false,&quot;manualOverride&quot;:{&quot;isManuallyOverridden&quot;:false,&quot;citeprocText&quot;:&quot;[6]&quot;,&quot;manualOverrideText&quot;:&quot;&quot;},&quot;citationTag&quot;:&quot;MENDELEY_CITATION_v3_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&quot;,&quot;citationItems&quot;:[{&quot;id&quot;:&quot;423bf9f3-29fb-399a-ac24-688086f07946&quot;,&quot;itemData&quot;:{&quot;type&quot;:&quot;webpage&quot;,&quot;id&quot;:&quot;423bf9f3-29fb-399a-ac24-688086f07946&quot;,&quot;title&quot;:&quot;CREATE PROCEDURE&quot;,&quot;author&quot;:[{&quot;family&quot;:&quot;PostgreSQL Global Development Group&quot;,&quot;given&quot;:&quot;&quot;,&quot;parse-names&quot;:false,&quot;dropping-particle&quot;:&quot;&quot;,&quot;non-dropping-particle&quot;:&quot;&quot;}],&quot;accessed&quot;:{&quot;date-parts&quot;:[[2026,7,15]]},&quot;URL&quot;:&quot;https://www.postgresql.org/docs/current/sql-createprocedure.html&quot;,&quot;container-title-short&quot;:&quot;&quot;},&quot;isTemporary&quot;:false,&quot;suppress-author&quot;:false,&quot;composite&quot;:false,&quot;author-only&quot;:false}]},{&quot;citationID&quot;:&quot;MENDELEY_CITATION_f9beb473-ffb6-42e4-9f68-b3721c1241b8&quot;,&quot;properties&quot;:{&quot;noteIndex&quot;:0},&quot;isEdited&quot;:false,&quot;manualOverride&quot;:{&quot;isManuallyOverridden&quot;:false,&quot;citeprocText&quot;:&quot;[7]&quot;,&quot;manualOverrideText&quot;:&quot;&quot;},&quot;citationTag&quot;:&quot;MENDELEY_CITATION_v3_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&quot;,&quot;citationItems&quot;:[{&quot;id&quot;:&quot;3bdb57c6-313e-3e0d-a285-86251bb00338&quot;,&quot;itemData&quot;:{&quot;type&quot;:&quot;webpage&quot;,&quot;id&quot;:&quot;3bdb57c6-313e-3e0d-a285-86251bb00338&quot;,&quot;title&quot;:&quot;Jakarta Persistence 3.0 Specification&quot;,&quot;author&quot;:[{&quot;family&quot;:&quot;Eclipse Foundation&quot;,&quot;given&quot;:&quot;&quot;,&quot;parse-names&quot;:false,&quot;dropping-particle&quot;:&quot;&quot;,&quot;non-dropping-particle&quot;:&quot;&quot;}],&quot;accessed&quot;:{&quot;date-parts&quot;:[[2026,7,15]]},&quot;URL&quot;:&quot;https://jakarta.ee/specifications/persistence/3.0/jakarta-persistence-spec-3.0.html&quot;,&quot;issued&quot;:{&quot;date-parts&quot;:[[2020]]},&quot;container-title-short&quot;:&quot;&quot;},&quot;isTemporary&quot;:false,&quot;suppress-author&quot;:false,&quot;composite&quot;:false,&quot;author-only&quot;:false}]}]"/>
     <we:property name="MENDELEY_CITATIONS_STYLE" value="{&quot;id&quot;:&quot;http://www.zotero.org/styles/ieee&quot;,&quot;title&quot;:&quot;IEEE Reference Guide version 11.29.2023&quot;,&quot;format&quot;:&quot;numeric&quot;,&quot;defaultLocale&quot;:null,&quot;isLocaleCodeValid&quot;:true}"/>
   </we:properties>
   <we:bindings/>

</xml_diff>